<commit_message>
Remove part that will be replace with objectd.
</commit_message>
<xml_diff>
--- a/Documentation/ObjectModel.docx
+++ b/Documentation/ObjectModel.docx
@@ -19,7 +19,15 @@
         </w:numPr>
       </w:pPr>
       <w:r>
-        <w:t>Get the algorithm for the simplified method.</w:t>
+        <w:t xml:space="preserve">Object model version of TaxTools is developed in branch </w:t>
+      </w:r>
+      <w:proofErr w:type="spellStart"/>
+      <w:r>
+        <w:t>oo</w:t>
+      </w:r>
+      <w:proofErr w:type="spellEnd"/>
+      <w:r>
+        <w:t>-dev.</w:t>
       </w:r>
     </w:p>
     <w:p>
@@ -31,7 +39,7 @@
         </w:numPr>
       </w:pPr>
       <w:r>
-        <w:t>Every form is created with input values. It does not change after it is created.</w:t>
+        <w:t>Get the algorithm for the simplified method.</w:t>
       </w:r>
     </w:p>
     <w:p>
@@ -43,13 +51,7 @@
         </w:numPr>
       </w:pPr>
       <w:r>
-        <w:t>A for</w:t>
-      </w:r>
-      <w:r>
-        <w:t>m</w:t>
-      </w:r>
-      <w:r>
-        <w:t xml:space="preserve"> can receive an input value that it should read from another form as a default value (for example, the 1040 form can receive wages as an input value rather than read it from a W-2 form).</w:t>
+        <w:t>Every form is created with input values. It does not change after it is created.</w:t>
       </w:r>
     </w:p>
     <w:p>
@@ -61,7 +63,13 @@
         </w:numPr>
       </w:pPr>
       <w:r>
-        <w:t>Form inputs are of two types: expected and default values. Inputs are name-value pairs. For default values, they must be for a specific line, thus, they can be specified by the line number or line label.</w:t>
+        <w:t>A for</w:t>
+      </w:r>
+      <w:r>
+        <w:t>m</w:t>
+      </w:r>
+      <w:r>
+        <w:t xml:space="preserve"> can receive an input value that it should read from another form as a default value (for example, the 1040 form can receive wages as an input value rather than read it from a W-2 form).</w:t>
       </w:r>
     </w:p>
     <w:p>
@@ -73,7 +81,7 @@
         </w:numPr>
       </w:pPr>
       <w:r>
-        <w:t>Forms are dependent on the tax year, so must be able to switch dynamically.</w:t>
+        <w:t>Form inputs are of two types: expected and default values. Inputs are name-value pairs. For default values, they must be for a specific line, thus, they can be specified by the line number or line label.</w:t>
       </w:r>
     </w:p>
     <w:p>
@@ -85,6 +93,18 @@
         </w:numPr>
       </w:pPr>
       <w:r>
+        <w:t>Forms are dependent on the tax year, so must be able to switch dynamically.</w:t>
+      </w:r>
+    </w:p>
+    <w:p>
+      <w:pPr>
+        <w:pStyle w:val="Body-Text"/>
+        <w:numPr>
+          <w:ilvl w:val="0"/>
+          <w:numId w:val="26"/>
+        </w:numPr>
+      </w:pPr>
+      <w:r>
         <w:t>The tools have two parts: the interface and the engine.</w:t>
       </w:r>
     </w:p>
@@ -366,6 +386,7 @@
         </w:numPr>
       </w:pPr>
       <w:r>
+        <w:lastRenderedPageBreak/>
         <w:t>Maximum value</w:t>
       </w:r>
     </w:p>
@@ -378,7 +399,6 @@
         </w:numPr>
       </w:pPr>
       <w:r>
-        <w:lastRenderedPageBreak/>
         <w:t>Minimum value</w:t>
       </w:r>
     </w:p>
@@ -678,6 +698,7 @@
         <w:pStyle w:val="List-Bullet025"/>
       </w:pPr>
       <w:r>
+        <w:lastRenderedPageBreak/>
         <w:t>Filing status</w:t>
       </w:r>
       <w:r>
@@ -693,7 +714,6 @@
         <w:pStyle w:val="List-Bullet025"/>
       </w:pPr>
       <w:r>
-        <w:lastRenderedPageBreak/>
         <w:t>Taxpayer</w:t>
       </w:r>
       <w:r>
@@ -4317,7 +4337,7 @@
 </file>
 
 <file path=customXml/itemProps1.xml><?xml version="1.0" encoding="utf-8"?>
-<ds:datastoreItem xmlns:ds="http://schemas.openxmlformats.org/officeDocument/2006/customXml" ds:itemID="{FE466875-52A5-4CCD-A369-3B9E058406E7}">
+<ds:datastoreItem xmlns:ds="http://schemas.openxmlformats.org/officeDocument/2006/customXml" ds:itemID="{7A3B42BA-27B3-4F7B-9A96-E732C43B4603}">
   <ds:schemaRefs>
     <ds:schemaRef ds:uri="http://schemas.openxmlformats.org/officeDocument/2006/bibliography"/>
   </ds:schemaRefs>

</xml_diff>